<commit_message>
notebook executed end to end on Mac with example data
</commit_message>
<xml_diff>
--- a/docs/Project_Milestone_Template.docx
+++ b/docs/Project_Milestone_Template.docx
@@ -59,18 +59,22 @@
       </w:pPr>
     </w:p>
     <w:p>
-      <w:pPr>
-        <w:rPr>
-          <w:b/>
-          <w:bCs/>
-        </w:rPr>
-      </w:pPr>
       <w:r>
         <w:rPr>
           <w:b/>
           <w:bCs/>
         </w:rPr>
         <w:t>Name:</w:t>
+      </w:r>
+      <w:r>
+        <w:rPr>
+          <w:b/>
+          <w:bCs/>
+        </w:rPr>
+        <w:t xml:space="preserve"> </w:t>
+      </w:r>
+      <w:r>
+        <w:t>Zoe Tomlinson</w:t>
       </w:r>
     </w:p>
     <w:p>

</xml_diff>